<commit_message>
agregando errores de tipografia
</commit_message>
<xml_diff>
--- a/docs/alcance del proyecto.docx
+++ b/docs/alcance del proyecto.docx
@@ -47,25 +47,17 @@
           <w:lang w:val="es-ES"/>
         </w:rPr>
       </w:pPr>
-      <w:proofErr w:type="gramStart"/>
       <w:r>
         <w:rPr>
           <w:lang w:val="es-ES"/>
         </w:rPr>
-        <w:t>Repositorio :</w:t>
-      </w:r>
-      <w:proofErr w:type="gramEnd"/>
+        <w:t xml:space="preserve">Repositorio : </w:t>
+      </w:r>
       <w:r>
         <w:rPr>
           <w:lang w:val="es-ES"/>
         </w:rPr>
-        <w:t xml:space="preserve"> </w:t>
-      </w:r>
-      <w:r>
-        <w:rPr>
-          <w:lang w:val="es-ES"/>
-        </w:rPr>
-        <w:t>https://github.com/josue-balbontin/Piscologo</w:t>
+        <w:t>https://github.com/josue-balbontin/Psicologo</w:t>
       </w:r>
     </w:p>
     <w:p>
@@ -968,42 +960,18 @@
           <w:lang w:eastAsia="es-BO"/>
           <w14:ligatures w14:val="none"/>
         </w:rPr>
-        <w:t xml:space="preserve">, </w:t>
-      </w:r>
-      <w:proofErr w:type="gramStart"/>
-      <w:r>
-        <w:rPr>
-          <w:rFonts w:ascii="Times New Roman" w:eastAsia="Times New Roman" w:hAnsi="Times New Roman" w:cs="Times New Roman"/>
-          <w:kern w:val="0"/>
-          <w:sz w:val="22"/>
-          <w:szCs w:val="22"/>
-          <w:lang w:eastAsia="es-BO"/>
-          <w14:ligatures w14:val="none"/>
-        </w:rPr>
-        <w:t xml:space="preserve">etc. </w:t>
-      </w:r>
-      <w:r>
-        <w:rPr>
-          <w:rFonts w:ascii="Times New Roman" w:eastAsia="Times New Roman" w:hAnsi="Times New Roman" w:cs="Times New Roman"/>
-          <w:kern w:val="0"/>
-          <w:sz w:val="22"/>
-          <w:szCs w:val="22"/>
-          <w:lang w:eastAsia="es-BO"/>
-          <w14:ligatures w14:val="none"/>
-        </w:rPr>
-        <w:t>)</w:t>
-      </w:r>
-      <w:proofErr w:type="gramEnd"/>
-      <w:r>
-        <w:rPr>
-          <w:rFonts w:ascii="Times New Roman" w:eastAsia="Times New Roman" w:hAnsi="Times New Roman" w:cs="Times New Roman"/>
-          <w:kern w:val="0"/>
-          <w:sz w:val="22"/>
-          <w:szCs w:val="22"/>
-          <w:lang w:eastAsia="es-BO"/>
-          <w14:ligatures w14:val="none"/>
-        </w:rPr>
-        <w:t xml:space="preserve"> en caso de que haya que corregir algún dato de este </w:t>
+        <w:t xml:space="preserve">, etc. </w:t>
+      </w:r>
+      <w:r>
+        <w:rPr>
+          <w:rFonts w:ascii="Times New Roman" w:eastAsia="Times New Roman" w:hAnsi="Times New Roman" w:cs="Times New Roman"/>
+          <w:kern w:val="0"/>
+          <w:sz w:val="22"/>
+          <w:szCs w:val="22"/>
+          <w:lang w:eastAsia="es-BO"/>
+          <w14:ligatures w14:val="none"/>
+        </w:rPr>
+        <w:t xml:space="preserve">) en caso de que haya que corregir algún dato de este </w:t>
       </w:r>
     </w:p>
     <w:p>
@@ -1250,19 +1218,7 @@
           <w:lang w:eastAsia="es-BO"/>
           <w14:ligatures w14:val="none"/>
         </w:rPr>
-        <w:t xml:space="preserve">El sistema debe ser lo suficientemente intuitivo para que el psicólogo pueda registrar una cita en máximo 7 </w:t>
-      </w:r>
-      <w:proofErr w:type="spellStart"/>
-      <w:r>
-        <w:rPr>
-          <w:rFonts w:ascii="Times New Roman" w:eastAsia="Times New Roman" w:hAnsi="Times New Roman" w:cs="Times New Roman"/>
-          <w:kern w:val="0"/>
-          <w:sz w:val="22"/>
-          <w:szCs w:val="22"/>
-          <w:lang w:eastAsia="es-BO"/>
-          <w14:ligatures w14:val="none"/>
-        </w:rPr>
-        <w:t>click</w:t>
+        <w:t>El sistema debe ser lo suficientemente intuitivo para que el psicólogo pueda registrar una cita en máximo 7 click</w:t>
       </w:r>
       <w:r>
         <w:rPr>
@@ -1275,7 +1231,6 @@
         </w:rPr>
         <w:t>s</w:t>
       </w:r>
-      <w:proofErr w:type="spellEnd"/>
       <w:r>
         <w:rPr>
           <w:rFonts w:ascii="Times New Roman" w:eastAsia="Times New Roman" w:hAnsi="Times New Roman" w:cs="Times New Roman"/>
@@ -1416,31 +1371,7 @@
           <w:lang w:eastAsia="es-BO"/>
           <w14:ligatures w14:val="none"/>
         </w:rPr>
-        <w:t>El sistema debe garantizar la protección de la base de datos contra ataques de inyección SQL (SQL-</w:t>
-      </w:r>
-      <w:proofErr w:type="spellStart"/>
-      <w:r>
-        <w:rPr>
-          <w:rFonts w:ascii="Times New Roman" w:eastAsia="Times New Roman" w:hAnsi="Times New Roman" w:cs="Times New Roman"/>
-          <w:kern w:val="0"/>
-          <w:sz w:val="22"/>
-          <w:szCs w:val="22"/>
-          <w:lang w:eastAsia="es-BO"/>
-          <w14:ligatures w14:val="none"/>
-        </w:rPr>
-        <w:t>injections</w:t>
-      </w:r>
-      <w:proofErr w:type="spellEnd"/>
-      <w:r>
-        <w:rPr>
-          <w:rFonts w:ascii="Times New Roman" w:eastAsia="Times New Roman" w:hAnsi="Times New Roman" w:cs="Times New Roman"/>
-          <w:kern w:val="0"/>
-          <w:sz w:val="22"/>
-          <w:szCs w:val="22"/>
-          <w:lang w:eastAsia="es-BO"/>
-          <w14:ligatures w14:val="none"/>
-        </w:rPr>
-        <w:t>) en todos sus campos de entrada y mantener un control de acceso básico mediante credenciales.</w:t>
+        <w:t>El sistema debe garantizar la protección de la base de datos contra ataques de inyección SQL (SQL-injections) en todos sus campos de entrada y mantener un control de acceso básico mediante credenciales.</w:t>
       </w:r>
     </w:p>
     <w:p>
@@ -2116,31 +2047,7 @@
           <w:lang w:eastAsia="es-BO"/>
           <w14:ligatures w14:val="none"/>
         </w:rPr>
-        <w:t xml:space="preserve">El sistema depende de dispositivos electrónicos capaces de ejecutar un navegador web actualizado (recomendable de la línea </w:t>
-      </w:r>
-      <w:proofErr w:type="spellStart"/>
-      <w:r>
-        <w:rPr>
-          <w:rFonts w:ascii="Times New Roman" w:eastAsia="Times New Roman" w:hAnsi="Times New Roman" w:cs="Times New Roman"/>
-          <w:kern w:val="0"/>
-          <w:sz w:val="22"/>
-          <w:szCs w:val="22"/>
-          <w:lang w:eastAsia="es-BO"/>
-          <w14:ligatures w14:val="none"/>
-        </w:rPr>
-        <w:t>chromium</w:t>
-      </w:r>
-      <w:proofErr w:type="spellEnd"/>
-      <w:r>
-        <w:rPr>
-          <w:rFonts w:ascii="Times New Roman" w:eastAsia="Times New Roman" w:hAnsi="Times New Roman" w:cs="Times New Roman"/>
-          <w:kern w:val="0"/>
-          <w:sz w:val="22"/>
-          <w:szCs w:val="22"/>
-          <w:lang w:eastAsia="es-BO"/>
-          <w14:ligatures w14:val="none"/>
-        </w:rPr>
-        <w:t xml:space="preserve"> para seguir estándares) para el correcto funcionamiento del sistema en caso de no contar con esto se podría experimentar una mala experiencia de usuario</w:t>
+        <w:t>El sistema depende de dispositivos electrónicos capaces de ejecutar un navegador web actualizado (recomendable de la línea chromium para seguir estándares) para el correcto funcionamiento del sistema en caso de no contar con esto se podría experimentar una mala experiencia de usuario</w:t>
       </w:r>
     </w:p>
     <w:p>

</xml_diff>